<commit_message>
Add new field to docx template and fix package error on hq service
</commit_message>
<xml_diff>
--- a/src/templates/Historia.docx
+++ b/src/templates/Historia.docx
@@ -87,36 +87,16 @@
                 <w:sz w:val="22"/>
                 <w:szCs w:val="22"/>
               </w:rPr>
-              <w:t xml:space="preserve">NOMBRE DEL </w:t>
-            </w:r>
-            <w:proofErr w:type="gramStart"/>
-            <w:r>
-              <w:rPr>
-                <w:rFonts w:ascii="Cambria" w:eastAsia="Cambria" w:hAnsi="Cambria" w:cs="Cambria"/>
-                <w:b/>
-                <w:sz w:val="22"/>
-                <w:szCs w:val="22"/>
-              </w:rPr>
-              <w:t xml:space="preserve">PACIENTE </w:t>
-            </w:r>
-            <w:r>
-              <w:rPr>
-                <w:rFonts w:ascii="Cambria" w:eastAsia="Cambria" w:hAnsi="Cambria" w:cs="Cambria"/>
-                <w:b/>
-                <w:sz w:val="22"/>
-                <w:szCs w:val="22"/>
-              </w:rPr>
-              <w:t>:</w:t>
-            </w:r>
-            <w:proofErr w:type="gramEnd"/>
-            <w:r>
-              <w:rPr>
-                <w:rFonts w:ascii="Cambria" w:eastAsia="Cambria" w:hAnsi="Cambria" w:cs="Cambria"/>
-                <w:b/>
-                <w:sz w:val="22"/>
-                <w:szCs w:val="22"/>
-              </w:rPr>
-              <w:t xml:space="preserve"> </w:t>
+              <w:t xml:space="preserve">NOMBRE DEL PACIENTE </w:t>
+            </w:r>
+            <w:r>
+              <w:rPr>
+                <w:rFonts w:ascii="Cambria" w:eastAsia="Cambria" w:hAnsi="Cambria" w:cs="Cambria"/>
+                <w:b/>
+                <w:sz w:val="22"/>
+                <w:szCs w:val="22"/>
+              </w:rPr>
+              <w:t xml:space="preserve">: </w:t>
             </w:r>
             <w:r>
               <w:rPr>
@@ -332,7 +312,6 @@
               </w:rPr>
               <w:t>EDAD</w:t>
             </w:r>
-            <w:proofErr w:type="gramStart"/>
             <w:r>
               <w:rPr>
                 <w:rFonts w:ascii="Cambria" w:eastAsia="Cambria" w:hAnsi="Cambria" w:cs="Cambria"/>
@@ -358,17 +337,7 @@
                 <w:sz w:val="22"/>
                 <w:szCs w:val="22"/>
               </w:rPr>
-              <w:t>[</w:t>
-            </w:r>
-            <w:proofErr w:type="gramEnd"/>
-            <w:r>
-              <w:rPr>
-                <w:rFonts w:ascii="Cambria" w:eastAsia="Cambria" w:hAnsi="Cambria" w:cs="Cambria"/>
-                <w:b/>
-                <w:sz w:val="22"/>
-                <w:szCs w:val="22"/>
-              </w:rPr>
-              <w:t>[</w:t>
+              <w:t>[[</w:t>
             </w:r>
             <w:r>
               <w:rPr>
@@ -415,7 +384,6 @@
                 <w:szCs w:val="22"/>
               </w:rPr>
             </w:pPr>
-            <w:proofErr w:type="gramStart"/>
             <w:r>
               <w:rPr>
                 <w:rFonts w:ascii="Cambria" w:eastAsia="Cambria" w:hAnsi="Cambria" w:cs="Cambria"/>
@@ -432,17 +400,7 @@
                 <w:sz w:val="22"/>
                 <w:szCs w:val="22"/>
               </w:rPr>
-              <w:t>[</w:t>
-            </w:r>
-            <w:proofErr w:type="gramEnd"/>
-            <w:r>
-              <w:rPr>
-                <w:rFonts w:ascii="Cambria" w:eastAsia="Cambria" w:hAnsi="Cambria" w:cs="Cambria"/>
-                <w:b/>
-                <w:sz w:val="22"/>
-                <w:szCs w:val="22"/>
-              </w:rPr>
-              <w:t>[</w:t>
+              <w:t>[[</w:t>
             </w:r>
             <w:r>
               <w:rPr>
@@ -675,7 +633,6 @@
                 <w:szCs w:val="22"/>
               </w:rPr>
             </w:pPr>
-            <w:proofErr w:type="gramStart"/>
             <w:r>
               <w:rPr>
                 <w:rFonts w:ascii="Cambria" w:eastAsia="Cambria" w:hAnsi="Cambria" w:cs="Cambria"/>
@@ -701,19 +658,8 @@
                 <w:sz w:val="22"/>
                 <w:szCs w:val="22"/>
               </w:rPr>
-              <w:t>[</w:t>
-            </w:r>
-            <w:proofErr w:type="gramEnd"/>
-            <w:r>
-              <w:rPr>
-                <w:rFonts w:ascii="Cambria" w:eastAsia="Cambria" w:hAnsi="Cambria" w:cs="Cambria"/>
-                <w:b/>
-                <w:sz w:val="22"/>
-                <w:szCs w:val="22"/>
-              </w:rPr>
-              <w:t>[</w:t>
-            </w:r>
-            <w:proofErr w:type="spellStart"/>
+              <w:t>[[</w:t>
+            </w:r>
             <w:r>
               <w:rPr>
                 <w:rFonts w:ascii="Cambria" w:eastAsia="Cambria" w:hAnsi="Cambria" w:cs="Cambria"/>
@@ -723,7 +669,6 @@
               </w:rPr>
               <w:t>direccion</w:t>
             </w:r>
-            <w:proofErr w:type="spellEnd"/>
             <w:r>
               <w:rPr>
                 <w:rFonts w:ascii="Cambria" w:eastAsia="Cambria" w:hAnsi="Cambria" w:cs="Cambria"/>
@@ -781,7 +726,6 @@
               </w:rPr>
               <w:t>[[</w:t>
             </w:r>
-            <w:proofErr w:type="spellStart"/>
             <w:r>
               <w:rPr>
                 <w:rFonts w:ascii="Cambria" w:eastAsia="Cambria" w:hAnsi="Cambria" w:cs="Cambria"/>
@@ -791,7 +735,6 @@
               </w:rPr>
               <w:t>telefono</w:t>
             </w:r>
-            <w:proofErr w:type="spellEnd"/>
             <w:r>
               <w:rPr>
                 <w:rFonts w:ascii="Cambria" w:eastAsia="Cambria" w:hAnsi="Cambria" w:cs="Cambria"/>
@@ -827,7 +770,6 @@
                 <w:szCs w:val="22"/>
               </w:rPr>
             </w:pPr>
-            <w:proofErr w:type="gramStart"/>
             <w:r>
               <w:rPr>
                 <w:rFonts w:ascii="Cambria" w:eastAsia="Cambria" w:hAnsi="Cambria" w:cs="Cambria"/>
@@ -853,19 +795,8 @@
                 <w:sz w:val="22"/>
                 <w:szCs w:val="22"/>
               </w:rPr>
-              <w:t>[</w:t>
-            </w:r>
-            <w:proofErr w:type="gramEnd"/>
-            <w:r>
-              <w:rPr>
-                <w:rFonts w:ascii="Cambria" w:eastAsia="Cambria" w:hAnsi="Cambria" w:cs="Cambria"/>
-                <w:b/>
-                <w:sz w:val="22"/>
-                <w:szCs w:val="22"/>
-              </w:rPr>
-              <w:t>[</w:t>
-            </w:r>
-            <w:proofErr w:type="spellStart"/>
+              <w:t>[[</w:t>
+            </w:r>
             <w:r>
               <w:rPr>
                 <w:rFonts w:ascii="Cambria" w:eastAsia="Cambria" w:hAnsi="Cambria" w:cs="Cambria"/>
@@ -875,7 +806,6 @@
               </w:rPr>
               <w:t>ocupacion</w:t>
             </w:r>
-            <w:proofErr w:type="spellEnd"/>
             <w:r>
               <w:rPr>
                 <w:rFonts w:ascii="Cambria" w:eastAsia="Cambria" w:hAnsi="Cambria" w:cs="Cambria"/>
@@ -925,7 +855,6 @@
               </w:rPr>
               <w:t>[[</w:t>
             </w:r>
-            <w:proofErr w:type="spellStart"/>
             <w:r>
               <w:rPr>
                 <w:rFonts w:ascii="Cambria" w:eastAsia="Cambria" w:hAnsi="Cambria" w:cs="Cambria"/>
@@ -935,7 +864,6 @@
               </w:rPr>
               <w:t>regimen</w:t>
             </w:r>
-            <w:proofErr w:type="spellEnd"/>
             <w:r>
               <w:rPr>
                 <w:rFonts w:ascii="Cambria" w:eastAsia="Cambria" w:hAnsi="Cambria" w:cs="Cambria"/>
@@ -993,7 +921,6 @@
               </w:rPr>
               <w:t>[[</w:t>
             </w:r>
-            <w:proofErr w:type="spellStart"/>
             <w:r>
               <w:rPr>
                 <w:rFonts w:ascii="Cambria" w:eastAsia="Cambria" w:hAnsi="Cambria" w:cs="Cambria"/>
@@ -1003,7 +930,6 @@
               </w:rPr>
               <w:t>eps</w:t>
             </w:r>
-            <w:proofErr w:type="spellEnd"/>
             <w:r>
               <w:rPr>
                 <w:rFonts w:ascii="Cambria" w:eastAsia="Cambria" w:hAnsi="Cambria" w:cs="Cambria"/>
@@ -1065,7 +991,6 @@
               </w:rPr>
               <w:t>[[</w:t>
             </w:r>
-            <w:proofErr w:type="spellStart"/>
             <w:r>
               <w:rPr>
                 <w:rFonts w:ascii="Cambria" w:eastAsia="Cambria" w:hAnsi="Cambria" w:cs="Cambria"/>
@@ -1074,7 +999,6 @@
               </w:rPr>
               <w:t>red_apoyo</w:t>
             </w:r>
-            <w:proofErr w:type="spellEnd"/>
             <w:r>
               <w:rPr>
                 <w:rFonts w:ascii="Cambria" w:eastAsia="Cambria" w:hAnsi="Cambria" w:cs="Cambria"/>
@@ -1117,17 +1041,7 @@
                 <w:sz w:val="22"/>
                 <w:szCs w:val="22"/>
               </w:rPr>
-              <w:t>MODALIDAD DEPORTIVA</w:t>
-            </w:r>
-            <w:proofErr w:type="gramStart"/>
-            <w:r>
-              <w:rPr>
-                <w:rFonts w:ascii="Cambria" w:eastAsia="Cambria" w:hAnsi="Cambria" w:cs="Cambria"/>
-                <w:b/>
-                <w:sz w:val="22"/>
-                <w:szCs w:val="22"/>
-              </w:rPr>
-              <w:t xml:space="preserve">: </w:t>
+              <w:t xml:space="preserve">MODALIDAD DEPORTIVA: </w:t>
             </w:r>
             <w:r>
               <w:rPr>
@@ -1145,17 +1059,7 @@
                 <w:sz w:val="22"/>
                 <w:szCs w:val="22"/>
               </w:rPr>
-              <w:t>[</w:t>
-            </w:r>
-            <w:proofErr w:type="gramEnd"/>
-            <w:r>
-              <w:rPr>
-                <w:rFonts w:ascii="Cambria" w:eastAsia="Cambria" w:hAnsi="Cambria" w:cs="Cambria"/>
-                <w:b/>
-                <w:sz w:val="22"/>
-                <w:szCs w:val="22"/>
-              </w:rPr>
-              <w:t>[</w:t>
+              <w:t>[[</w:t>
             </w:r>
             <w:r>
               <w:rPr>
@@ -1251,7 +1155,6 @@
               </w:rPr>
               <w:t>DIAGNÓSTICO MÉDICO (CIE-10</w:t>
             </w:r>
-            <w:proofErr w:type="gramStart"/>
             <w:r>
               <w:rPr>
                 <w:rFonts w:ascii="Cambria" w:eastAsia="Cambria" w:hAnsi="Cambria" w:cs="Cambria"/>
@@ -1268,17 +1171,7 @@
                 <w:sz w:val="22"/>
                 <w:szCs w:val="22"/>
               </w:rPr>
-              <w:t>:</w:t>
-            </w:r>
-            <w:proofErr w:type="gramEnd"/>
-            <w:r>
-              <w:rPr>
-                <w:rFonts w:ascii="Cambria" w:eastAsia="Cambria" w:hAnsi="Cambria" w:cs="Cambria"/>
-                <w:b/>
-                <w:sz w:val="22"/>
-                <w:szCs w:val="22"/>
-              </w:rPr>
-              <w:t xml:space="preserve"> </w:t>
+              <w:t xml:space="preserve">: </w:t>
             </w:r>
             <w:r>
               <w:rPr>
@@ -1371,11 +1264,9 @@
             <w:r>
               <w:t>[[</w:t>
             </w:r>
-            <w:proofErr w:type="spellStart"/>
             <w:r>
               <w:t>antecedentes_patologicos</w:t>
             </w:r>
-            <w:proofErr w:type="spellEnd"/>
             <w:r>
               <w:t>]]</w:t>
             </w:r>
@@ -1412,11 +1303,9 @@
             <w:r>
               <w:t>[[</w:t>
             </w:r>
-            <w:proofErr w:type="spellStart"/>
             <w:r>
               <w:t>antecedentes_quirurgicos</w:t>
             </w:r>
-            <w:proofErr w:type="spellEnd"/>
             <w:r>
               <w:t>]]</w:t>
             </w:r>
@@ -1438,11 +1327,9 @@
             <w:r>
               <w:t>[[</w:t>
             </w:r>
-            <w:proofErr w:type="spellStart"/>
             <w:r>
               <w:t>antecedentes_traumaticos</w:t>
             </w:r>
-            <w:proofErr w:type="spellEnd"/>
             <w:r>
               <w:t>]]</w:t>
             </w:r>
@@ -1474,11 +1361,9 @@
             <w:r>
               <w:t>[[</w:t>
             </w:r>
-            <w:proofErr w:type="spellStart"/>
             <w:r>
               <w:t>antecedentes_farmacologicos</w:t>
             </w:r>
-            <w:proofErr w:type="spellEnd"/>
             <w:r>
               <w:t>]]</w:t>
             </w:r>
@@ -1525,11 +1410,9 @@
             <w:r>
               <w:t>[[</w:t>
             </w:r>
-            <w:proofErr w:type="spellStart"/>
             <w:r>
               <w:t>antecedentes_familiares</w:t>
             </w:r>
-            <w:proofErr w:type="spellEnd"/>
             <w:r>
               <w:t>]]</w:t>
             </w:r>
@@ -1576,11 +1459,9 @@
             <w:r>
               <w:t>[[</w:t>
             </w:r>
-            <w:proofErr w:type="spellStart"/>
             <w:r>
               <w:t>antecedentes_sociales</w:t>
             </w:r>
-            <w:proofErr w:type="spellEnd"/>
             <w:r>
               <w:t>]]</w:t>
             </w:r>
@@ -1838,11 +1719,9 @@
                   <w:pPr>
                     <w:ind w:left="0" w:hanging="2"/>
                   </w:pPr>
-                  <w:proofErr w:type="spellStart"/>
                   <w:r>
                     <w:t>Phalen</w:t>
                   </w:r>
-                  <w:proofErr w:type="spellEnd"/>
                   <w:r>
                     <w:rPr>
                       <w:rFonts w:ascii="Segoe UI Emoji" w:hAnsi="Segoe UI Emoji" w:cs="Segoe UI Emoji"/>
@@ -1892,11 +1771,9 @@
                   <w:pPr>
                     <w:ind w:left="0" w:hanging="2"/>
                   </w:pPr>
-                  <w:proofErr w:type="spellStart"/>
                   <w:r>
                     <w:t>Tinel</w:t>
                   </w:r>
-                  <w:proofErr w:type="spellEnd"/>
                   <w:r>
                     <w:rPr>
                       <w:rFonts w:ascii="Segoe UI Emoji" w:hAnsi="Segoe UI Emoji" w:cs="Segoe UI Emoji"/>
@@ -1946,13 +1823,8 @@
                   <w:pPr>
                     <w:ind w:left="0" w:hanging="2"/>
                   </w:pPr>
-                  <w:proofErr w:type="spellStart"/>
                   <w:r>
-                    <w:t>Durkan</w:t>
-                  </w:r>
-                  <w:proofErr w:type="spellEnd"/>
-                  <w:r>
-                    <w:t xml:space="preserve"> (Compresión directa)</w:t>
+                    <w:t>Durkan (Compresión directa)</w:t>
                   </w:r>
                   <w:r>
                     <w:rPr>
@@ -2003,13 +1875,8 @@
                   <w:pPr>
                     <w:ind w:left="0" w:hanging="2"/>
                   </w:pPr>
-                  <w:proofErr w:type="spellStart"/>
                   <w:r>
-                    <w:t>Flick</w:t>
-                  </w:r>
-                  <w:proofErr w:type="spellEnd"/>
-                  <w:r>
-                    <w:t xml:space="preserve"> Test</w:t>
+                    <w:t>Flick Test</w:t>
                   </w:r>
                   <w:r>
                     <w:rPr>
@@ -2217,11 +2084,9 @@
             <w:r>
               <w:t>[[</w:t>
             </w:r>
-            <w:proofErr w:type="spellStart"/>
             <w:r>
               <w:t>intervencion</w:t>
             </w:r>
-            <w:proofErr w:type="spellEnd"/>
             <w:r>
               <w:t>]]</w:t>
             </w:r>
@@ -2244,17 +2109,7 @@
                 <w:sz w:val="22"/>
                 <w:szCs w:val="22"/>
               </w:rPr>
-              <w:t>Estado</w:t>
-            </w:r>
-            <w:proofErr w:type="gramStart"/>
-            <w:r>
-              <w:rPr>
-                <w:rFonts w:ascii="Cambria" w:eastAsia="Cambria" w:hAnsi="Cambria" w:cs="Cambria"/>
-                <w:b/>
-                <w:sz w:val="22"/>
-                <w:szCs w:val="22"/>
-              </w:rPr>
-              <w:t>:</w:t>
+              <w:t>Estado:</w:t>
             </w:r>
             <w:r>
               <w:rPr>
@@ -2269,11 +2124,7 @@
               <w:t xml:space="preserve"> </w:t>
             </w:r>
             <w:r>
-              <w:t>[</w:t>
-            </w:r>
-            <w:proofErr w:type="gramEnd"/>
-            <w:r>
-              <w:t>[</w:t>
+              <w:t>[[</w:t>
             </w:r>
             <w:r>
               <w:t>estado</w:t>
@@ -2306,7 +2157,13 @@
               <w:t xml:space="preserve"> </w:t>
             </w:r>
             <w:r>
-              <w:t>[[]]</w:t>
+              <w:t>[[</w:t>
+            </w:r>
+            <w:r>
+              <w:t>recomendaciones</w:t>
+            </w:r>
+            <w:r>
+              <w:t>]]</w:t>
             </w:r>
           </w:p>
           <w:p>

</xml_diff>